<commit_message>
Add in-text citations of Figures 1-6 and Tables 1-4 throughout chapter
- Figure 1 cited in Section 1.3 (AI workflow description)
- Table 1 cited in Section 2.2 (deep learning architectures)
- Figure 2 + Table 2 cited in Section 2.2 (model performance)
- Figure 3 cited in Section 2.3 (GAN architecture)
- Table 3 + Figure 4 cited in Section 2.4 (RL and optimization)
- Figure 5 cited in Section 2.5 (HTS and active learning)
- Table 2 cited in Section 3.1 (property prediction benchmarks)
- Figure 6 cited in Section 3.4 (forensic applications)
- Table 4 cited in Section 4.1 (challenges overview)

Total: 13 figure mentions, 9 table mentions across all sections
</commit_message>
<xml_diff>
--- a/Chapter_16_AI_Assisted_Design_of_Nanomaterials.docx
+++ b/Chapter_16_AI_Assisted_Design_of_Nanomaterials.docx
@@ -274,7 +274,7 @@
           <w:szCs w:val="24"/>
           <w:rFonts w:ascii="Times New Roman" w:hAnsi="Times New Roman"/>
         </w:rPr>
-        <w:t xml:space="preserve">The AI workflow for nanomaterial discovery typically follows an iterative cycle comprising: (1) data collection and curation from experimental literature and computational databases; (2) feature engineering and descriptor selection to encode material characteristics numerically; (3) model training, validation, and selection using appropriate ML architectures; (4) property prediction and virtual screening of candidate materials; (5) inverse design to generate novel structures with target properties; and (6) experimental validation with active learning feedback to refine models iteratively [3,4].</w:t>
+        <w:t xml:space="preserve">The AI workflow for nanomaterial discovery typically follows an iterative cycle comprising: (1) data collection and curation from experimental literature and computational databases; (2) feature engineering and descriptor selection to encode material characteristics numerically; (3) model training, validation, and selection using appropriate ML architectures; (4) property prediction and virtual screening of candidate materials; (5) inverse design to generate novel structures with target properties; and (6) experimental validation with active learning feedback to refine models iteratively [3,4]. This workflow is schematically illustrated in Figure 1, which depicts the iterative cycle with active learning feedback integration that enables continuous model improvement.</w:t>
       </w:r>
     </w:p>
     <w:p>
@@ -415,18 +415,18 @@
           <w:szCs w:val="24"/>
           <w:rFonts w:ascii="Times New Roman" w:hAnsi="Times New Roman"/>
         </w:rPr>
-        <w:t xml:space="preserve">Deep learning extends traditional machine learning through multi-layered neural network architectures capable of learning hierarchical representations directly from raw data [25]. Several architectures have proven particularly effective for nanomaterial design. Convolutional Neural Networks (CNNs) excel at processing grid-structured data and have been applied extensively to microscopy image analysis for automated nanostructure classification and defect detection [26]. Graph Neural Networks (GNNs) represent materials as graphs where atoms are nodes and chemical bonds are edges, achieving state-of-the-art property prediction through message-passing operations that naturally encode crystallographic symmetries and periodic boundary conditions [12,13].</w:t>
-      </w:r>
-    </w:p>
-    <w:p>
-      <w:pPr/>
-      <w:r>
-        <w:rPr>
-          <w:sz w:val="24"/>
-          <w:szCs w:val="24"/>
-          <w:rFonts w:ascii="Times New Roman" w:hAnsi="Times New Roman"/>
-        </w:rPr>
-        <w:t xml:space="preserve">The Crystal Graph Convolutional Neural Network (CGCNN) and Materials Graph Network (MEGNet) frameworks have demonstrated remarkable accuracy in predicting formation energies, band gaps, and elastic properties approaching DFT-level uncertainty with computational costs reduced by several orders of magnitude [27]. Transformer architectures, originally developed for natural language processing, have been adapted for materials science applications including text mining of scientific literature and multi-modal property prediction [28]. Variational Autoencoders (VAEs) and Generative Adversarial Networks (GANs) represent generative deep learning approaches capable of producing entirely novel material structures not present in training databases [29,30].</w:t>
+        <w:t xml:space="preserve">Deep learning extends traditional machine learning through multi-layered neural network architectures capable of learning hierarchical representations directly from raw data [25]. Several architectures have proven particularly effective for nanomaterial design, as summarized in Table 1. Convolutional Neural Networks (CNNs) excel at processing grid-structured data and have been applied extensively to microscopy image analysis for automated nanostructure classification and defect detection [26]. Graph Neural Networks (GNNs) represent materials as graphs where atoms are nodes and chemical bonds are edges, achieving state-of-the-art property prediction through message-passing operations that naturally encode crystallographic symmetries and periodic boundary conditions [12,13].</w:t>
+      </w:r>
+    </w:p>
+    <w:p>
+      <w:pPr/>
+      <w:r>
+        <w:rPr>
+          <w:sz w:val="24"/>
+          <w:szCs w:val="24"/>
+          <w:rFonts w:ascii="Times New Roman" w:hAnsi="Times New Roman"/>
+        </w:rPr>
+        <w:t xml:space="preserve">The Crystal Graph Convolutional Neural Network (CGCNN) and Materials Graph Network (MEGNet) frameworks have demonstrated remarkable accuracy in predicting formation energies, band gaps, and elastic properties approaching DFT-level uncertainty with computational costs reduced by several orders of magnitude [27]. A performance comparison of these models across multiple properties is presented in Figure 2 and quantified in Table 2. Transformer architectures, originally developed for natural language processing, have been adapted for materials science applications including text mining of scientific literature and multi-modal property prediction [28]. Variational Autoencoders (VAEs) and Generative Adversarial Networks (GANs) represent generative deep learning approaches capable of producing entirely novel material structures not present in training databases [29,30].</w:t>
       </w:r>
     </w:p>
     <w:p>
@@ -472,7 +472,7 @@
           <w:szCs w:val="24"/>
           <w:rFonts w:ascii="Times New Roman" w:hAnsi="Times New Roman"/>
         </w:rPr>
-        <w:t xml:space="preserve">Generative Adversarial Networks consist of competing generator and discriminator networks trained adversarially. Conditional GANs (cGANs) enable targeted inverse design by conditioning the generator on desired property vectors [30]. Applications include generation of porous materials with specified surface areas and pore volumes, plasmonic nanostructure design for maximum electromagnetic enhancement [42], and creation of graphene/BN hybrid structures with tailored electronic properties [43]. The AlloyGAN framework combines large language model text mining with conditional GANs for inverse alloy design [44].</w:t>
+        <w:t xml:space="preserve">Generative Adversarial Networks consist of competing generator and discriminator networks trained adversarially, as illustrated in Figure 3. Conditional GANs (cGANs) enable targeted inverse design by conditioning the generator on desired property vectors [30]. Applications include generation of porous materials with specified surface areas and pore volumes, plasmonic nanostructure design for maximum electromagnetic enhancement [42], and creation of graphene/BN hybrid structures with tailored electronic properties [43]. The AlloyGAN framework combines large language model text mining with conditional GANs for inverse alloy design [44].</w:t>
       </w:r>
     </w:p>
     <w:p>
@@ -507,7 +507,7 @@
           <w:szCs w:val="24"/>
           <w:rFonts w:ascii="Times New Roman" w:hAnsi="Times New Roman"/>
         </w:rPr>
-        <w:t xml:space="preserve">Reinforcement learning formulates nanomaterial design as a sequential decision-making problem with states representing current material configurations, actions corresponding to atomic or compositional modifications, and rewards derived from property evaluations [23,24]. Deep Q-Networks (DQN) and Proximal Policy Optimization (PPO) algorithms have discovered compositions with properties 2-5 times superior to random search baselines [46]. RL agents can optimize element ordering in bimetallic nanoparticles to simultaneously maximize catalytic activity and stability [47]. Reinforcement fine-tuning of generative models combines the strengths of discriminative and generative capabilities, enabling property-directed generation [48].</w:t>
+        <w:t xml:space="preserve">Reinforcement learning formulates nanomaterial design as a sequential decision-making problem with states representing current material configurations, actions corresponding to atomic or compositional modifications, and rewards derived from property evaluations [23,24], as depicted in Figure 4. Deep Q-Networks (DQN) and Proximal Policy Optimization (PPO) algorithms have discovered compositions with properties 2-5 times superior to random search baselines [46]. RL agents can optimize element ordering in bimetallic nanoparticles to simultaneously maximize catalytic activity and stability [47]. Reinforcement fine-tuning of generative models combines the strengths of discriminative and generative capabilities, enabling property-directed generation [48]. A comparison of optimization strategies including RL, Bayesian optimization, and evolutionary methods is provided in Table 3.</w:t>
       </w:r>
     </w:p>
     <w:p>
@@ -542,18 +542,18 @@
           <w:szCs w:val="24"/>
           <w:rFonts w:ascii="Times New Roman" w:hAnsi="Times New Roman"/>
         </w:rPr>
-        <w:t xml:space="preserve">High-throughput virtual screening leverages ML surrogate models to rapidly assess millions of candidate materials through hierarchical filtering pipelines [2,10]. A typical screening workflow proceeds through stages: combinatorial enumeration of candidate compositions, thermodynamic stability screening using formation energy predictions, target property evaluation using trained ML models, DFT validation of top candidates, and synthesis feasibility assessment. GNN models enable crystal-structure-aware screening that accounts for polymorphism and structural diversity [13,27].</w:t>
-      </w:r>
-    </w:p>
-    <w:p>
-      <w:pPr/>
-      <w:r>
-        <w:rPr>
-          <w:sz w:val="24"/>
-          <w:szCs w:val="24"/>
-          <w:rFonts w:ascii="Times New Roman" w:hAnsi="Times New Roman"/>
-        </w:rPr>
-        <w:t xml:space="preserve">Active learning represents an intelligent data acquisition strategy that selects the most informative experiments to maximize information gain per sample [52]. By combining uncertainty quantification with acquisition functions, active learning campaigns have demonstrated 3-10 times improvement in discovery efficiency compared to random experimental campaigns. Self-driving laboratories combine AI-driven experimental design with robotic synthesis platforms and automated characterization instruments, enabling closed-loop optimization without human intervention [53]. These autonomous platforms have achieved greater than 95% morphological yield for gold nanostructures in fewer than 100 iterations, while neural network interatomic potentials enable rapid molecular dynamics simulations at near-DFT accuracy for property evaluation [36].</w:t>
+        <w:t xml:space="preserve">High-throughput virtual screening leverages ML surrogate models to rapidly assess millions of candidate materials through hierarchical filtering pipelines [2,10], as illustrated by the screening funnel in Figure 5. A typical screening workflow proceeds through stages: combinatorial enumeration of candidate compositions, thermodynamic stability screening using formation energy predictions, target property evaluation using trained ML models, DFT validation of top candidates, and synthesis feasibility assessment. GNN models enable crystal-structure-aware screening that accounts for polymorphism and structural diversity [13,27].</w:t>
+      </w:r>
+    </w:p>
+    <w:p>
+      <w:pPr/>
+      <w:r>
+        <w:rPr>
+          <w:sz w:val="24"/>
+          <w:szCs w:val="24"/>
+          <w:rFonts w:ascii="Times New Roman" w:hAnsi="Times New Roman"/>
+        </w:rPr>
+        <w:t xml:space="preserve">Active learning represents an intelligent data acquisition strategy that selects the most informative experiments to maximize information gain per sample [52]. By combining uncertainty quantification with acquisition functions, active learning campaigns have demonstrated 3-10 times improvement in discovery efficiency compared to random experimental campaigns, as shown in Figure 5(c). Self-driving laboratories combine AI-driven experimental design with robotic synthesis platforms and automated characterization instruments, enabling closed-loop optimization without human intervention [53]. These autonomous platforms have achieved greater than 95% morphological yield for gold nanostructures in fewer than 100 iterations, while neural network interatomic potentials enable rapid molecular dynamics simulations at near-DFT accuracy for property evaluation [36].</w:t>
       </w:r>
     </w:p>
     <w:p>
@@ -2597,7 +2597,7 @@
           <w:szCs w:val="24"/>
           <w:rFonts w:ascii="Times New Roman" w:hAnsi="Times New Roman"/>
         </w:rPr>
-        <w:t xml:space="preserve">Machine learning models trained on curated datasets have demonstrated remarkable accuracy in predicting diverse nanomaterial properties across multiple domains. Band gap prediction using gradient boosting methods achieves mean absolute error (MAE) below 0.3 eV on benchmark datasets from the Materials Project [34]. Formation energy prediction using CGCNN and MEGNet approaches DFT-level uncertainty of approximately 25 meV/atom [13,27]. For nanoparticle-specific properties, ML models successfully predict catalytic activity of alloy nanoparticles, localized surface plasmon resonance wavelengths of gold and silver nanostructures, quantum dot emission spectra, and colloidal stability indicators [35,36].</w:t>
+        <w:t xml:space="preserve">Machine learning models trained on curated datasets have demonstrated remarkable accuracy in predicting diverse nanomaterial properties across multiple domains, with performance benchmarks detailed in Table 2. Band gap prediction using gradient boosting methods achieves mean absolute error (MAE) below 0.3 eV on benchmark datasets from the Materials Project [34]. Formation energy prediction using CGCNN and MEGNet approaches DFT-level uncertainty of approximately 25 meV/atom [13,27]. For nanoparticle-specific properties, ML models successfully predict catalytic activity of alloy nanoparticles, localized surface plasmon resonance wavelengths of gold and silver nanostructures, quantum dot emission spectra, and colloidal stability indicators [35,36].</w:t>
       </w:r>
     </w:p>
     <w:p>
@@ -2691,7 +2691,7 @@
           <w:szCs w:val="24"/>
           <w:rFonts w:ascii="Times New Roman" w:hAnsi="Times New Roman"/>
         </w:rPr>
-        <w:t xml:space="preserve">The application of AI-designed nanomaterials to forensic science represents a rapidly emerging field with transformative potential for criminal investigation and justice systems [6,7]. AI methodologies enable the rational design of nanomaterials with properties specifically optimized for forensic detection challenges, including sensitivity, selectivity, stability under field conditions, and compatibility with diverse evidence substrates.</w:t>
+        <w:t xml:space="preserve">The application of AI-designed nanomaterials to forensic science represents a rapidly emerging field with transformative potential for criminal investigation and justice systems [6,7]. AI methodologies enable the rational design of nanomaterials with properties specifically optimized for forensic detection challenges, including sensitivity, selectivity, stability under field conditions, and compatibility with diverse evidence substrates. The key forensic applications of AI-designed nanomaterials are summarized schematically in Figure 6.</w:t>
       </w:r>
     </w:p>
     <w:p>
@@ -2981,7 +2981,7 @@
           <w:szCs w:val="24"/>
           <w:rFonts w:ascii="Times New Roman" w:hAnsi="Times New Roman"/>
         </w:rPr>
-        <w:t xml:space="preserve">Despite remarkable progress, several fundamental challenges impede the full realization of AI-assisted nanomaterial design. Data scarcity remains the most pervasive limitation, as most nanomaterial datasets contain fewer than 1,000 samples, far below the requirements for robust deep learning model training [3,4]. Unlike domains such as computer vision or natural language processing where millions of labeled examples are readily available, materials data requires expensive experimental measurements or computationally intensive simulations to generate. Solutions under active development include transfer learning from data-rich to data-scarce domains, physics-informed data augmentation, few-shot learning architectures, multi-fidelity approaches combining data at different accuracy levels, and federated learning frameworks enabling collaborative model training without sharing proprietary data [37].</w:t>
+        <w:t xml:space="preserve">Despite remarkable progress, several fundamental challenges impede the full realization of AI-assisted nanomaterial design, as summarized in Table 4. Data scarcity remains the most pervasive limitation, as most nanomaterial datasets contain fewer than 1,000 samples, far below the requirements for robust deep learning model training [3,4]. Unlike domains such as computer vision or natural language processing where millions of labeled examples are readily available, materials data requires expensive experimental measurements or computationally intensive simulations to generate. Solutions under active development include transfer learning from data-rich to data-scarce domains, physics-informed data augmentation, few-shot learning architectures, multi-fidelity approaches combining data at different accuracy levels, and federated learning frameworks enabling collaborative model training without sharing proprietary data [37].</w:t>
       </w:r>
     </w:p>
     <w:p>

</xml_diff>